<commit_message>
Update technical assessment document
</commit_message>
<xml_diff>
--- a/src/main/resources/Technical Assessment QA.docx
+++ b/src/main/resources/Technical Assessment QA.docx
@@ -212,18 +212,33 @@
                 <w14:ligatures w14:val="none"/>
               </w:rPr>
             </w:pPr>
-            <w:r>
-              <w:rPr>
-                <w:rFonts w:eastAsia="Times New Roman" w:cs="Times New Roman" w:ascii="Aptos Narrow" w:hAnsi="Aptos Narrow"/>
-                <w:b/>
-                <w:bCs/>
-                <w:color w:val="000000"/>
-                <w:kern w:val="0"/>
-                <w:sz w:val="22"/>
-                <w:szCs w:val="22"/>
-                <w14:ligatures w14:val="none"/>
-              </w:rPr>
-              <w:t>target%</w:t>
+            <w:bookmarkStart w:id="0" w:name="__DdeLink__258_126979977"/>
+            <w:r>
+              <w:rPr>
+                <w:rFonts w:eastAsia="Times New Roman" w:cs="Times New Roman" w:ascii="Aptos Narrow" w:hAnsi="Aptos Narrow"/>
+                <w:b/>
+                <w:bCs/>
+                <w:color w:val="000000"/>
+                <w:kern w:val="0"/>
+                <w:sz w:val="22"/>
+                <w:szCs w:val="22"/>
+                <w14:ligatures w14:val="none"/>
+              </w:rPr>
+              <w:t>target</w:t>
+            </w:r>
+            <w:bookmarkEnd w:id="0"/>
+            <w:r>
+              <w:rPr>
+                <w:rFonts w:eastAsia="Times New Roman" w:cs="Times New Roman" w:ascii="Aptos Narrow" w:hAnsi="Aptos Narrow"/>
+                <w:b/>
+                <w:bCs/>
+                <w:color w:val="000000"/>
+                <w:kern w:val="0"/>
+                <w:sz w:val="22"/>
+                <w:szCs w:val="22"/>
+                <w14:ligatures w14:val="none"/>
+              </w:rPr>
+              <w:t>%</w:t>
             </w:r>
           </w:p>
         </w:tc>
@@ -1218,7 +1233,33 @@
                 <w:szCs w:val="22"/>
                 <w14:ligatures w14:val="none"/>
               </w:rPr>
-              <w:t>45.45 ve</w:t>
+              <w:t xml:space="preserve">45.45 </w:t>
+            </w:r>
+            <w:r>
+              <w:rPr>
+                <w:rFonts w:eastAsia="Times New Roman" w:cs="Times New Roman" w:ascii="Aptos Narrow" w:hAnsi="Aptos Narrow"/>
+                <w:b/>
+                <w:bCs/>
+                <w:color w:val="000000"/>
+                <w:kern w:val="0"/>
+                <w:sz w:val="22"/>
+                <w:szCs w:val="22"/>
+                <w14:ligatures w14:val="none"/>
+              </w:rPr>
+              <w:t>+</w:t>
+            </w:r>
+            <w:r>
+              <w:rPr>
+                <w:rFonts w:eastAsia="Times New Roman" w:cs="Times New Roman" w:ascii="Aptos Narrow" w:hAnsi="Aptos Narrow"/>
+                <w:b/>
+                <w:bCs/>
+                <w:color w:val="000000"/>
+                <w:kern w:val="0"/>
+                <w:sz w:val="22"/>
+                <w:szCs w:val="22"/>
+                <w14:ligatures w14:val="none"/>
+              </w:rPr>
+              <w:t>ve</w:t>
             </w:r>
           </w:p>
         </w:tc>
@@ -3011,15 +3052,75 @@
     <w:p>
       <w:pPr>
         <w:pStyle w:val="Normal"/>
-        <w:widowControl/>
-        <w:bidi w:val="0"/>
-        <w:spacing w:lineRule="auto" w:line="278" w:before="0" w:after="160"/>
-        <w:jc w:val="start"/>
         <w:rPr/>
       </w:pPr>
       <w:r>
         <w:rPr/>
         <w:t>**If you make any assumptions, please note that.</w:t>
+        <w:br/>
+        <w:br/>
+      </w:r>
+      <w:r>
+        <w:rPr>
+          <w:b/>
+          <w:bCs/>
+        </w:rPr>
+        <w:t>Manula test cases.</w:t>
+        <w:br/>
+        <w:br/>
+        <w:t>Test 1: verify the page consistancy with the product documents for visual layout, Include inconsitat capitalisation and spelling.</w:t>
+        <w:br/>
+        <w:br/>
+        <w:t>Test2: verify the total Target Assets  correctly add up to the 100%</w:t>
+      </w:r>
+    </w:p>
+    <w:p>
+      <w:pPr>
+        <w:pStyle w:val="Normal"/>
+        <w:rPr>
+          <w:b/>
+          <w:bCs/>
+        </w:rPr>
+      </w:pPr>
+      <w:r>
+        <w:rPr>
+          <w:b/>
+          <w:bCs/>
+        </w:rPr>
+        <w:t>Test3: verify the total held assets correctly add up to 100%</w:t>
+      </w:r>
+    </w:p>
+    <w:p>
+      <w:pPr>
+        <w:pStyle w:val="Normal"/>
+        <w:rPr>
+          <w:b/>
+          <w:bCs/>
+        </w:rPr>
+      </w:pPr>
+      <w:r>
+        <w:rPr>
+          <w:b/>
+          <w:bCs/>
+        </w:rPr>
+        <w:t>Test4: verify the variance between held and target are correct.</w:t>
+      </w:r>
+    </w:p>
+    <w:p>
+      <w:pPr>
+        <w:pStyle w:val="Normal"/>
+        <w:spacing w:before="0" w:after="160"/>
+        <w:rPr>
+          <w:b/>
+          <w:bCs/>
+        </w:rPr>
+      </w:pPr>
+      <w:r>
+        <w:rPr>
+          <w:b/>
+          <w:bCs/>
+        </w:rPr>
+        <w:t>Test5: verify the corective action to achive target assets is correctly calculated. The cash value of the variance divided by the share price should return the number of shares to buy or sell. (the vairance is a precentage of the total asset fund.)</w:t>
       </w:r>
     </w:p>
     <w:sectPr>
@@ -3172,7 +3273,7 @@
       <mc:AlternateContent>
         <mc:Choice Requires="wps">
           <w:drawing>
-            <wp:anchor distT="0" distB="0" distL="0" distR="12065" simplePos="0" relativeHeight="6" behindDoc="1" locked="0" layoutInCell="0" allowOverlap="1" wp14:anchorId="794771D7">
+            <wp:anchor distT="0" distB="0" distL="0" distR="12065" simplePos="0" relativeHeight="8" behindDoc="1" locked="0" layoutInCell="0" allowOverlap="1" wp14:anchorId="794771D7">
               <wp:simplePos x="0" y="0"/>
               <wp:positionH relativeFrom="page">
                 <wp:align>center</wp:align>
@@ -3294,7 +3395,7 @@
       <mc:AlternateContent>
         <mc:Choice Requires="wps">
           <w:drawing>
-            <wp:anchor distT="0" distB="0" distL="0" distR="12065" simplePos="0" relativeHeight="6" behindDoc="1" locked="0" layoutInCell="0" allowOverlap="1" wp14:anchorId="794771D7">
+            <wp:anchor distT="0" distB="0" distL="0" distR="12065" simplePos="0" relativeHeight="8" behindDoc="1" locked="0" layoutInCell="0" allowOverlap="1" wp14:anchorId="794771D7">
               <wp:simplePos x="0" y="0"/>
               <wp:positionH relativeFrom="page">
                 <wp:align>center</wp:align>
@@ -4709,6 +4810,29 @@
     <w:pPr/>
     <w:rPr/>
   </w:style>
+  <w:style w:type="paragraph" w:styleId="TableContents">
+    <w:name w:val="Table Contents"/>
+    <w:basedOn w:val="Normal"/>
+    <w:qFormat/>
+    <w:pPr>
+      <w:widowControl w:val="false"/>
+      <w:suppressLineNumbers/>
+    </w:pPr>
+    <w:rPr/>
+  </w:style>
+  <w:style w:type="paragraph" w:styleId="TableHeading">
+    <w:name w:val="Table Heading"/>
+    <w:basedOn w:val="TableContents"/>
+    <w:qFormat/>
+    <w:pPr>
+      <w:suppressLineNumbers/>
+      <w:jc w:val="center"/>
+    </w:pPr>
+    <w:rPr>
+      <w:b/>
+      <w:bCs/>
+    </w:rPr>
+  </w:style>
   <w:style w:type="numbering" w:styleId="NoList" w:default="1">
     <w:name w:val="No List"/>
     <w:uiPriority w:val="99"/>

</xml_diff>